<commit_message>
Remove leftover placeholders from code in PR3 report
Co-Authored-By: Claude Sonnet 5.5 <noreply@anthropic.com>
Claude-Session: https://claude.ai/code/session_011DSASePq9E2J7c3UPJh5aF
</commit_message>
<xml_diff>
--- a/outputs/Отчет_ПР3_ускорение_загрузки.docx
+++ b/outputs/Отчет_ПР3_ускорение_загрузки.docx
@@ -3620,19 +3620,6 @@
           <w:sz w:val="20"/>
           <w:szCs w:val="20"/>
         </w:rPr>
-        <w:t>&lt;style&gt;...&lt;/style&gt;</w:t>
-      </w:r>
-    </w:p>
-    <w:p>
-      <w:pPr>
-        <w:shd w:val="clear" w:color="auto" w:fill="F2F2F2"/>
-      </w:pPr>
-      <w:r>
-        <w:rPr>
-          <w:rFonts w:ascii="Courier New" w:eastAsia="Courier New" w:hAnsi="Courier New" w:cs="Courier New"/>
-          <w:sz w:val="20"/>
-          <w:szCs w:val="20"/>
-        </w:rPr>
         <w:t>&lt;link rel="stylesheet" href="css/animations.min.css"</w:t>
       </w:r>
     </w:p>
@@ -3888,15 +3875,7 @@
           <w:sz w:val="20"/>
           <w:szCs w:val="20"/>
         </w:rPr>
-        <w:t>.cookie { position: fixed; left: 0; right: 0; bottom: 0; z-index: 10; .</w:t>
-      </w:r>
-      <w:r>
-        <w:rPr>
-          <w:rFonts w:ascii="Courier New" w:eastAsia="Courier New" w:hAnsi="Courier New" w:cs="Courier New"/>
-          <w:sz w:val="20"/>
-          <w:szCs w:val="20"/>
-        </w:rPr>
-        <w:t>.. }</w:t>
+        <w:t>.cookie { position: fixed; left: 0; right: 0; bottom: 0; z-index: 10; }</w:t>
       </w:r>
     </w:p>
     <w:p>

</xml_diff>